<commit_message>
case study exercise 3
</commit_message>
<xml_diff>
--- a/ids312/CaseStudyExercise3.docx
+++ b/ids312/CaseStudyExercise3.docx
@@ -272,6 +272,12 @@
                 <w:sz w:val="16"/>
               </w:rPr>
             </w:pPr>
+            <w:r>
+              <w:rPr>
+                <w:sz w:val="16"/>
+              </w:rPr>
+              <w:t xml:space="preserve"> UW-Madison Office Move</w:t>
+            </w:r>
           </w:p>
         </w:tc>
         <w:tc>
@@ -351,6 +357,12 @@
                 <w:sz w:val="16"/>
               </w:rPr>
             </w:pPr>
+            <w:r>
+              <w:rPr>
+                <w:sz w:val="16"/>
+              </w:rPr>
+              <w:t xml:space="preserve"> UW-Madison Department Chair</w:t>
+            </w:r>
           </w:p>
         </w:tc>
         <w:tc>
@@ -430,6 +442,12 @@
                 <w:sz w:val="16"/>
               </w:rPr>
             </w:pPr>
+            <w:r>
+              <w:rPr>
+                <w:sz w:val="16"/>
+              </w:rPr>
+              <w:t xml:space="preserve"> Dylan Smith</w:t>
+            </w:r>
           </w:p>
         </w:tc>
         <w:tc>
@@ -509,6 +527,12 @@
                 <w:sz w:val="16"/>
               </w:rPr>
             </w:pPr>
+            <w:r>
+              <w:rPr>
+                <w:sz w:val="16"/>
+              </w:rPr>
+              <w:t xml:space="preserve"> UW-Madison CFO, UW-Madison Department Chair </w:t>
+            </w:r>
           </w:p>
         </w:tc>
         <w:tc>
@@ -672,6 +696,54 @@
                 <w:sz w:val="20"/>
               </w:rPr>
             </w:pPr>
+            <w:r>
+              <w:rPr>
+                <w:sz w:val="20"/>
+              </w:rPr>
+              <w:t xml:space="preserve"> The purpose of this project is to </w:t>
+            </w:r>
+            <w:r>
+              <w:rPr>
+                <w:sz w:val="20"/>
+              </w:rPr>
+              <w:t>manage an important campus move that includes the</w:t>
+            </w:r>
+            <w:r>
+              <w:rPr>
+                <w:sz w:val="20"/>
+              </w:rPr>
+              <w:t xml:space="preserve"> </w:t>
+            </w:r>
+            <w:r>
+              <w:rPr>
+                <w:sz w:val="20"/>
+              </w:rPr>
+              <w:t xml:space="preserve">coordination of an office remodeling </w:t>
+            </w:r>
+            <w:r>
+              <w:rPr>
+                <w:sz w:val="20"/>
+              </w:rPr>
+              <w:t xml:space="preserve">                      p</w:t>
+            </w:r>
+            <w:r>
+              <w:rPr>
+                <w:sz w:val="20"/>
+              </w:rPr>
+              <w:t>roject and moving staff from two office units into a</w:t>
+            </w:r>
+            <w:r>
+              <w:rPr>
+                <w:sz w:val="20"/>
+              </w:rPr>
+              <w:t xml:space="preserve"> </w:t>
+            </w:r>
+            <w:r>
+              <w:rPr>
+                <w:sz w:val="20"/>
+              </w:rPr>
+              <w:t>consolidated space</w:t>
+            </w:r>
           </w:p>
         </w:tc>
         <w:tc>
@@ -1000,6 +1072,128 @@
                 <w:sz w:val="20"/>
               </w:rPr>
             </w:pPr>
+            <w:r>
+              <w:rPr>
+                <w:sz w:val="20"/>
+              </w:rPr>
+              <w:t xml:space="preserve"> </w:t>
+            </w:r>
+            <w:r>
+              <w:rPr>
+                <w:sz w:val="20"/>
+              </w:rPr>
+              <w:t xml:space="preserve">UW-Madison has been awarded a $5 million grant for an </w:t>
+            </w:r>
+            <w:proofErr w:type="gramStart"/>
+            <w:r>
+              <w:rPr>
+                <w:sz w:val="20"/>
+              </w:rPr>
+              <w:t>innovation</w:t>
+            </w:r>
+            <w:proofErr w:type="gramEnd"/>
+            <w:r>
+              <w:rPr>
+                <w:sz w:val="20"/>
+              </w:rPr>
+              <w:t xml:space="preserve"> research project that is</w:t>
+            </w:r>
+          </w:p>
+          <w:p>
+            <w:pPr>
+              <w:pStyle w:val="TableParagraph"/>
+              <w:rPr>
+                <w:sz w:val="20"/>
+              </w:rPr>
+            </w:pPr>
+            <w:r>
+              <w:rPr>
+                <w:sz w:val="20"/>
+              </w:rPr>
+              <w:t>scheduled to begin in 6 months</w:t>
+            </w:r>
+            <w:r>
+              <w:rPr>
+                <w:sz w:val="20"/>
+              </w:rPr>
+              <w:t xml:space="preserve">. </w:t>
+            </w:r>
+            <w:r>
+              <w:rPr>
+                <w:sz w:val="20"/>
+              </w:rPr>
+              <w:t>The office space needs to be ready for occupancy in 5 months to allow</w:t>
+            </w:r>
+          </w:p>
+          <w:p>
+            <w:pPr>
+              <w:pStyle w:val="TableParagraph"/>
+              <w:rPr>
+                <w:sz w:val="20"/>
+              </w:rPr>
+            </w:pPr>
+            <w:r>
+              <w:rPr>
+                <w:sz w:val="20"/>
+              </w:rPr>
+              <w:t>the move to occur during month 6 so everyone is in place for the official kickoff of the $5</w:t>
+            </w:r>
+          </w:p>
+          <w:p>
+            <w:pPr>
+              <w:pStyle w:val="TableParagraph"/>
+              <w:rPr>
+                <w:sz w:val="20"/>
+              </w:rPr>
+            </w:pPr>
+            <w:r>
+              <w:rPr>
+                <w:sz w:val="20"/>
+              </w:rPr>
+              <w:t xml:space="preserve">million innovation </w:t>
+            </w:r>
+            <w:proofErr w:type="gramStart"/>
+            <w:r>
+              <w:rPr>
+                <w:sz w:val="20"/>
+              </w:rPr>
+              <w:t>grant</w:t>
+            </w:r>
+            <w:proofErr w:type="gramEnd"/>
+            <w:r>
+              <w:rPr>
+                <w:sz w:val="20"/>
+              </w:rPr>
+              <w:t xml:space="preserve">. </w:t>
+            </w:r>
+            <w:proofErr w:type="gramStart"/>
+            <w:r>
+              <w:rPr>
+                <w:sz w:val="20"/>
+              </w:rPr>
+              <w:t>The 78</w:t>
+            </w:r>
+            <w:proofErr w:type="gramEnd"/>
+            <w:r>
+              <w:rPr>
+                <w:sz w:val="20"/>
+              </w:rPr>
+              <w:t xml:space="preserve"> people are currently located in two different buildings on</w:t>
+            </w:r>
+          </w:p>
+          <w:p>
+            <w:pPr>
+              <w:pStyle w:val="TableParagraph"/>
+              <w:rPr>
+                <w:sz w:val="20"/>
+              </w:rPr>
+            </w:pPr>
+            <w:r>
+              <w:rPr>
+                <w:sz w:val="20"/>
+              </w:rPr>
+              <w:t>campus.</w:t>
+            </w:r>
           </w:p>
         </w:tc>
         <w:tc>
@@ -1249,6 +1443,12 @@
                 <w:sz w:val="16"/>
               </w:rPr>
             </w:pPr>
+            <w:r>
+              <w:rPr>
+                <w:sz w:val="16"/>
+              </w:rPr>
+              <w:t xml:space="preserve"> UW-Madison Department Heads</w:t>
+            </w:r>
           </w:p>
         </w:tc>
         <w:tc>
@@ -1263,6 +1463,12 @@
                 <w:sz w:val="16"/>
               </w:rPr>
             </w:pPr>
+            <w:r>
+              <w:rPr>
+                <w:sz w:val="16"/>
+              </w:rPr>
+              <w:t xml:space="preserve"> Maximize flexibility and mobility of the space</w:t>
+            </w:r>
           </w:p>
         </w:tc>
         <w:tc>
@@ -1301,6 +1507,12 @@
                 <w:sz w:val="16"/>
               </w:rPr>
             </w:pPr>
+            <w:r>
+              <w:rPr>
+                <w:sz w:val="16"/>
+              </w:rPr>
+              <w:t xml:space="preserve"> UW-Madison Team Leads</w:t>
+            </w:r>
           </w:p>
         </w:tc>
         <w:tc>
@@ -1315,6 +1527,12 @@
                 <w:sz w:val="16"/>
               </w:rPr>
             </w:pPr>
+            <w:r>
+              <w:rPr>
+                <w:sz w:val="16"/>
+              </w:rPr>
+              <w:t xml:space="preserve"> Usable office space, wireless connections, portable cubicle walls</w:t>
+            </w:r>
           </w:p>
         </w:tc>
         <w:tc>
@@ -1458,6 +1676,12 @@
                 <w:sz w:val="20"/>
               </w:rPr>
             </w:pPr>
+            <w:r>
+              <w:rPr>
+                <w:sz w:val="20"/>
+              </w:rPr>
+              <w:t xml:space="preserve"> Move the 78 people currently located in two different buildings into one space within six months.</w:t>
+            </w:r>
           </w:p>
         </w:tc>
         <w:tc>
@@ -1536,6 +1760,72 @@
                 <w:sz w:val="20"/>
               </w:rPr>
             </w:pPr>
+            <w:r>
+              <w:rPr>
+                <w:sz w:val="20"/>
+              </w:rPr>
+              <w:t xml:space="preserve"> </w:t>
+            </w:r>
+            <w:r>
+              <w:rPr>
+                <w:sz w:val="20"/>
+              </w:rPr>
+              <w:t xml:space="preserve">The scope of </w:t>
+            </w:r>
+            <w:r>
+              <w:rPr>
+                <w:sz w:val="20"/>
+              </w:rPr>
+              <w:t>the</w:t>
+            </w:r>
+            <w:r>
+              <w:rPr>
+                <w:sz w:val="20"/>
+              </w:rPr>
+              <w:t xml:space="preserve"> project includes overseeing the schedules for demolition as well as</w:t>
+            </w:r>
+          </w:p>
+          <w:p>
+            <w:pPr>
+              <w:pStyle w:val="TableParagraph"/>
+              <w:rPr>
+                <w:sz w:val="20"/>
+              </w:rPr>
+            </w:pPr>
+            <w:r>
+              <w:rPr>
+                <w:sz w:val="20"/>
+              </w:rPr>
+              <w:t xml:space="preserve">coordinating the ordering of new furniture/ computers, and </w:t>
+            </w:r>
+            <w:proofErr w:type="gramStart"/>
+            <w:r>
+              <w:rPr>
+                <w:sz w:val="20"/>
+              </w:rPr>
+              <w:t>the construction</w:t>
+            </w:r>
+            <w:proofErr w:type="gramEnd"/>
+            <w:r>
+              <w:rPr>
+                <w:sz w:val="20"/>
+              </w:rPr>
+              <w:t>. It also includes</w:t>
+            </w:r>
+          </w:p>
+          <w:p>
+            <w:pPr>
+              <w:pStyle w:val="TableParagraph"/>
+              <w:rPr>
+                <w:sz w:val="20"/>
+              </w:rPr>
+            </w:pPr>
+            <w:r>
+              <w:rPr>
+                <w:sz w:val="20"/>
+              </w:rPr>
+              <w:t>coordinating the move of the staff into their new space.</w:t>
+            </w:r>
           </w:p>
         </w:tc>
         <w:tc>
@@ -1597,6 +1887,12 @@
                 <w:sz w:val="20"/>
               </w:rPr>
             </w:pPr>
+            <w:r>
+              <w:rPr>
+                <w:sz w:val="20"/>
+              </w:rPr>
+              <w:t xml:space="preserve"> Demolition schedule, plan for ordering the furniture, plan for wiring electrical and internet, space layout and design</w:t>
+            </w:r>
           </w:p>
         </w:tc>
         <w:tc>
@@ -1947,6 +2243,26 @@
                 <w:sz w:val="20"/>
               </w:rPr>
             </w:pPr>
+            <w:r>
+              <w:rPr>
+                <w:sz w:val="20"/>
+              </w:rPr>
+              <w:t xml:space="preserve"> The space layout and design </w:t>
+            </w:r>
+            <w:proofErr w:type="gramStart"/>
+            <w:r>
+              <w:rPr>
+                <w:sz w:val="20"/>
+              </w:rPr>
+              <w:t>fails</w:t>
+            </w:r>
+            <w:proofErr w:type="gramEnd"/>
+            <w:r>
+              <w:rPr>
+                <w:sz w:val="20"/>
+              </w:rPr>
+              <w:t xml:space="preserve"> inspection, the furniture does not arrive on time, the demolition goes long, there are delays in construction</w:t>
+            </w:r>
           </w:p>
         </w:tc>
         <w:tc>
@@ -2147,6 +2463,148 @@
                 <w:sz w:val="20"/>
               </w:rPr>
             </w:pPr>
+            <w:r>
+              <w:rPr>
+                <w:sz w:val="20"/>
+              </w:rPr>
+              <w:t xml:space="preserve"> Month 1 – </w:t>
+            </w:r>
+            <w:r>
+              <w:rPr>
+                <w:sz w:val="20"/>
+              </w:rPr>
+              <w:t>Design</w:t>
+            </w:r>
+            <w:r>
+              <w:rPr>
+                <w:sz w:val="20"/>
+              </w:rPr>
+              <w:t xml:space="preserve"> </w:t>
+            </w:r>
+            <w:r>
+              <w:rPr>
+                <w:sz w:val="20"/>
+              </w:rPr>
+              <w:t>proposal</w:t>
+            </w:r>
+            <w:r>
+              <w:rPr>
+                <w:sz w:val="20"/>
+              </w:rPr>
+              <w:t xml:space="preserve"> </w:t>
+            </w:r>
+            <w:r>
+              <w:rPr>
+                <w:sz w:val="20"/>
+              </w:rPr>
+              <w:t>approved</w:t>
+            </w:r>
+            <w:r>
+              <w:rPr>
+                <w:sz w:val="20"/>
+              </w:rPr>
+              <w:t xml:space="preserve">, </w:t>
+            </w:r>
+            <w:r>
+              <w:rPr>
+                <w:sz w:val="20"/>
+              </w:rPr>
+              <w:t>Construction</w:t>
+            </w:r>
+            <w:r>
+              <w:rPr>
+                <w:sz w:val="20"/>
+              </w:rPr>
+              <w:t xml:space="preserve"> </w:t>
+            </w:r>
+            <w:r>
+              <w:rPr>
+                <w:sz w:val="20"/>
+              </w:rPr>
+              <w:t>contract</w:t>
+            </w:r>
+            <w:r>
+              <w:rPr>
+                <w:sz w:val="20"/>
+              </w:rPr>
+              <w:t xml:space="preserve"> </w:t>
+            </w:r>
+            <w:r>
+              <w:rPr>
+                <w:sz w:val="20"/>
+              </w:rPr>
+              <w:t>awarded</w:t>
+            </w:r>
+          </w:p>
+          <w:p>
+            <w:pPr>
+              <w:pStyle w:val="TableParagraph"/>
+              <w:rPr>
+                <w:sz w:val="20"/>
+              </w:rPr>
+            </w:pPr>
+            <w:r>
+              <w:rPr>
+                <w:sz w:val="20"/>
+              </w:rPr>
+              <w:t xml:space="preserve"> Month 2 – Order modular furniture</w:t>
+            </w:r>
+          </w:p>
+          <w:p>
+            <w:pPr>
+              <w:pStyle w:val="TableParagraph"/>
+              <w:rPr>
+                <w:sz w:val="20"/>
+              </w:rPr>
+            </w:pPr>
+            <w:r>
+              <w:rPr>
+                <w:sz w:val="20"/>
+              </w:rPr>
+              <w:t xml:space="preserve"> Month 3 – Begin demolition</w:t>
+            </w:r>
+          </w:p>
+          <w:p>
+            <w:pPr>
+              <w:pStyle w:val="TableParagraph"/>
+              <w:rPr>
+                <w:sz w:val="20"/>
+              </w:rPr>
+            </w:pPr>
+            <w:r>
+              <w:rPr>
+                <w:sz w:val="20"/>
+              </w:rPr>
+              <w:t xml:space="preserve"> Month 4 – Begin construction</w:t>
+            </w:r>
+          </w:p>
+          <w:p>
+            <w:pPr>
+              <w:pStyle w:val="TableParagraph"/>
+              <w:rPr>
+                <w:sz w:val="20"/>
+              </w:rPr>
+            </w:pPr>
+            <w:r>
+              <w:rPr>
+                <w:sz w:val="20"/>
+              </w:rPr>
+              <w:t xml:space="preserve"> Month 5 – Modular office installation</w:t>
+            </w:r>
+          </w:p>
+          <w:p>
+            <w:pPr>
+              <w:pStyle w:val="TableParagraph"/>
+              <w:rPr>
+                <w:sz w:val="20"/>
+              </w:rPr>
+            </w:pPr>
+            <w:r>
+              <w:rPr>
+                <w:sz w:val="20"/>
+              </w:rPr>
+              <w:t xml:space="preserve"> Month 6 – Complete the move</w:t>
+            </w:r>
           </w:p>
         </w:tc>
         <w:tc>
@@ -2355,6 +2813,12 @@
                 <w:sz w:val="20"/>
               </w:rPr>
             </w:pPr>
+            <w:r>
+              <w:rPr>
+                <w:sz w:val="20"/>
+              </w:rPr>
+              <w:t xml:space="preserve"> $450,000</w:t>
+            </w:r>
           </w:p>
         </w:tc>
         <w:tc>
@@ -2647,6 +3111,40 @@
                 <w:sz w:val="20"/>
               </w:rPr>
             </w:pPr>
+            <w:r>
+              <w:rPr>
+                <w:sz w:val="20"/>
+              </w:rPr>
+              <w:t xml:space="preserve"> </w:t>
+            </w:r>
+            <w:proofErr w:type="gramStart"/>
+            <w:r>
+              <w:rPr>
+                <w:sz w:val="20"/>
+              </w:rPr>
+              <w:t>30 minute</w:t>
+            </w:r>
+            <w:proofErr w:type="gramEnd"/>
+            <w:r>
+              <w:rPr>
+                <w:sz w:val="20"/>
+              </w:rPr>
+              <w:t xml:space="preserve"> weekly updates with key stakeholders, </w:t>
+            </w:r>
+            <w:proofErr w:type="gramStart"/>
+            <w:r>
+              <w:rPr>
+                <w:sz w:val="20"/>
+              </w:rPr>
+              <w:t>15 minute</w:t>
+            </w:r>
+            <w:proofErr w:type="gramEnd"/>
+            <w:r>
+              <w:rPr>
+                <w:sz w:val="20"/>
+              </w:rPr>
+              <w:t xml:space="preserve"> standups with construction crew</w:t>
+            </w:r>
           </w:p>
         </w:tc>
         <w:tc>
@@ -2947,6 +3445,26 @@
                 <w:sz w:val="20"/>
               </w:rPr>
             </w:pPr>
+            <w:r>
+              <w:rPr>
+                <w:sz w:val="20"/>
+              </w:rPr>
+              <w:t xml:space="preserve"> An issue spreadsheet will be created and reviewed with project </w:t>
+            </w:r>
+            <w:proofErr w:type="gramStart"/>
+            <w:r>
+              <w:rPr>
+                <w:sz w:val="20"/>
+              </w:rPr>
+              <w:t>stakeholder</w:t>
+            </w:r>
+            <w:proofErr w:type="gramEnd"/>
+            <w:r>
+              <w:rPr>
+                <w:sz w:val="20"/>
+              </w:rPr>
+              <w:t xml:space="preserve"> during weekly meetings</w:t>
+            </w:r>
           </w:p>
         </w:tc>
         <w:tc>
@@ -3210,6 +3728,12 @@
                 <w:sz w:val="16"/>
               </w:rPr>
             </w:pPr>
+            <w:r>
+              <w:rPr>
+                <w:sz w:val="16"/>
+              </w:rPr>
+              <w:t xml:space="preserve"> Construction Foreman</w:t>
+            </w:r>
           </w:p>
         </w:tc>
         <w:tc>
@@ -3224,6 +3748,12 @@
                 <w:sz w:val="16"/>
               </w:rPr>
             </w:pPr>
+            <w:r>
+              <w:rPr>
+                <w:sz w:val="16"/>
+              </w:rPr>
+              <w:t xml:space="preserve"> Construction Foreman</w:t>
+            </w:r>
           </w:p>
         </w:tc>
         <w:tc>
@@ -3237,6 +3767,12 @@
                 <w:sz w:val="16"/>
               </w:rPr>
             </w:pPr>
+            <w:r>
+              <w:rPr>
+                <w:sz w:val="16"/>
+              </w:rPr>
+              <w:t xml:space="preserve"> Manages the construction</w:t>
+            </w:r>
           </w:p>
         </w:tc>
         <w:tc>
@@ -3276,6 +3812,12 @@
                 <w:sz w:val="16"/>
               </w:rPr>
             </w:pPr>
+            <w:r>
+              <w:rPr>
+                <w:sz w:val="16"/>
+              </w:rPr>
+              <w:t xml:space="preserve"> Interior Designer</w:t>
+            </w:r>
           </w:p>
         </w:tc>
         <w:tc>
@@ -3293,6 +3835,12 @@
                 <w:sz w:val="16"/>
               </w:rPr>
             </w:pPr>
+            <w:r>
+              <w:rPr>
+                <w:sz w:val="16"/>
+              </w:rPr>
+              <w:t xml:space="preserve"> Interior Designer</w:t>
+            </w:r>
           </w:p>
         </w:tc>
         <w:tc>
@@ -3309,6 +3857,12 @@
                 <w:sz w:val="16"/>
               </w:rPr>
             </w:pPr>
+            <w:r>
+              <w:rPr>
+                <w:sz w:val="16"/>
+              </w:rPr>
+              <w:t xml:space="preserve"> Designs the layout and selects the modular furniture</w:t>
+            </w:r>
           </w:p>
         </w:tc>
         <w:tc>
@@ -3550,6 +4104,12 @@
                 <w:sz w:val="16"/>
               </w:rPr>
             </w:pPr>
+            <w:r>
+              <w:rPr>
+                <w:sz w:val="16"/>
+              </w:rPr>
+              <w:t xml:space="preserve"> UW-Madison Department Heads</w:t>
+            </w:r>
           </w:p>
         </w:tc>
         <w:tc>
@@ -3564,6 +4124,12 @@
                 <w:sz w:val="16"/>
               </w:rPr>
             </w:pPr>
+            <w:r>
+              <w:rPr>
+                <w:sz w:val="16"/>
+              </w:rPr>
+              <w:t xml:space="preserve"> Review issues and approve plans</w:t>
+            </w:r>
           </w:p>
         </w:tc>
         <w:tc>
@@ -3657,6 +4223,7 @@
     <w:p>
       <w:pPr>
         <w:tabs>
+          <w:tab w:val="left" w:pos="3640"/>
           <w:tab w:val="left" w:pos="5399"/>
           <w:tab w:val="left" w:pos="5653"/>
           <w:tab w:val="left" w:pos="7365"/>
@@ -3668,6 +4235,22 @@
           <w:sz w:val="20"/>
         </w:rPr>
       </w:pPr>
+      <w:r>
+        <w:rPr>
+          <w:b/>
+          <w:sz w:val="20"/>
+          <w:u w:val="single"/>
+        </w:rPr>
+        <w:t xml:space="preserve"> </w:t>
+      </w:r>
+      <w:r>
+        <w:rPr>
+          <w:b/>
+          <w:sz w:val="20"/>
+          <w:u w:val="single"/>
+        </w:rPr>
+        <w:tab/>
+      </w:r>
       <w:r>
         <w:rPr>
           <w:b/>

</xml_diff>